<commit_message>
docs: actualizar resumen MVP con sección cross-platform (Vercel + roadmap móvil)
Añadidas 2 nuevas secciones al resumen ejecutivo del MVP:

- 06 · Cross-platform desde día uno: diagrama de arquitectura
  centrada en Supabase + tabla de hosting recomendado por componente
  (GitHub Pages para marketing, Vercel para web app, Supabase para
  backend).

- 07 · Roadmap móvil (3 etapas): tabla comparativa de PWA / Capacitor
  / React Native con tiempo, tecnología y resultado esperado para cada
  una.

Añadida también una línea a 'Próximos pasos': evaluar Capacitor para
tiendas de apps después de los primeros 3 meses de validación.
</commit_message>
<xml_diff>
--- a/TorrePalmas_WebApp_MVP_Resumen.docx
+++ b/TorrePalmas_WebApp_MVP_Resumen.docx
@@ -1662,7 +1662,1524 @@
     <w:p>
       <w:pPr>
         <w:pStyle w:val="Heading2"/>
-        <w:spacing w:after="100" w:before="240"/>
+        <w:spacing w:after="100" w:before="320"/>
+      </w:pPr>
+      <w:r>
+        <w:rPr>
+          <w:rFonts w:ascii="Calibri" w:cs="Calibri" w:eastAsia="Calibri" w:hAnsi="Calibri"/>
+          <w:b/>
+          <w:bCs/>
+          <w:color w:val="1A1F18"/>
+          <w:sz w:val="24"/>
+          <w:szCs w:val="24"/>
+        </w:rPr>
+        <w:t xml:space="preserve">06 · Cross-platform desde día uno</w:t>
+      </w:r>
+    </w:p>
+    <w:p>
+      <w:pPr>
+        <w:spacing w:after="160" w:before="60"/>
+        <w:jc w:val="left"/>
+      </w:pPr>
+      <w:r>
+        <w:rPr>
+          <w:rFonts w:ascii="Calibri" w:cs="Calibri" w:eastAsia="Calibri" w:hAnsi="Calibri"/>
+          <w:i/>
+          <w:iCs/>
+          <w:color w:val="4A5446"/>
+          <w:sz w:val="22"/>
+          <w:szCs w:val="22"/>
+        </w:rPr>
+        <w:t xml:space="preserve">El backend en Supabase es el centro: web y móvil consumen la misma API. Esto significa que cuando llegue el momento de tener una app móvil, no rehacemos nada del backend — solo construimos un cliente adicional.</w:t>
+      </w:r>
+    </w:p>
+    <w:tbl>
+      <w:tblPr>
+        <w:tblW w:type="dxa" w:w="9300"/>
+        <w:tblBorders>
+          <w:top w:val="single" w:color="auto" w:sz="4"/>
+          <w:left w:val="single" w:color="auto" w:sz="4"/>
+          <w:bottom w:val="single" w:color="auto" w:sz="4"/>
+          <w:right w:val="single" w:color="auto" w:sz="4"/>
+          <w:insideH w:val="single" w:color="auto" w:sz="4"/>
+          <w:insideV w:val="single" w:color="auto" w:sz="4"/>
+        </w:tblBorders>
+      </w:tblPr>
+      <w:tblGrid>
+        <w:gridCol w:w="3125"/>
+        <w:gridCol w:w="3050"/>
+        <w:gridCol w:w="3125"/>
+      </w:tblGrid>
+      <w:tr>
+        <w:tc>
+          <w:tcPr>
+            <w:tcW w:type="dxa" w:w="3125"/>
+            <w:tcBorders>
+              <w:top w:val="single" w:color="FFFFFF" w:sz="4"/>
+              <w:left w:val="single" w:color="FFFFFF" w:sz="4"/>
+              <w:bottom w:val="single" w:color="FFFFFF" w:sz="4"/>
+              <w:right w:val="single" w:color="FFFFFF" w:sz="4"/>
+            </w:tcBorders>
+            <w:tcMar>
+              <w:top w:type="dxa" w:w="0"/>
+              <w:left w:type="dxa" w:w="0"/>
+              <w:bottom w:type="dxa" w:w="0"/>
+              <w:right w:type="dxa" w:w="0"/>
+            </w:tcMar>
+          </w:tcPr>
+          <w:p>
+            <w:r>
+              <w:t xml:space="preserve"/>
+            </w:r>
+          </w:p>
+        </w:tc>
+        <w:tc>
+          <w:tcPr>
+            <w:tcW w:type="dxa" w:w="3050"/>
+            <w:tcBorders>
+              <w:top w:val="single" w:color="0E7A3B" w:sz="4"/>
+              <w:left w:val="single" w:color="0E7A3B" w:sz="4"/>
+              <w:bottom w:val="single" w:color="0E7A3B" w:sz="4"/>
+              <w:right w:val="single" w:color="0E7A3B" w:sz="4"/>
+            </w:tcBorders>
+            <w:shd w:fill="0E7A3B" w:val="clear"/>
+            <w:tcMar>
+              <w:top w:type="dxa" w:w="130"/>
+              <w:left w:type="dxa" w:w="130"/>
+              <w:bottom w:type="dxa" w:w="130"/>
+              <w:right w:type="dxa" w:w="130"/>
+            </w:tcMar>
+            <w:vAlign w:val="center"/>
+          </w:tcPr>
+          <w:p>
+            <w:pPr>
+              <w:spacing w:after="50" w:before="0"/>
+              <w:jc w:val="center"/>
+            </w:pPr>
+            <w:r>
+              <w:rPr>
+                <w:rFonts w:ascii="Calibri" w:cs="Calibri" w:eastAsia="Calibri" w:hAnsi="Calibri"/>
+                <w:b/>
+                <w:bCs/>
+                <w:color w:val="FFFFFF"/>
+                <w:sz w:val="22"/>
+                <w:szCs w:val="22"/>
+              </w:rPr>
+              <w:t xml:space="preserve">SUPABASE</w:t>
+            </w:r>
+          </w:p>
+          <w:p>
+            <w:pPr>
+              <w:spacing w:after="0" w:before="0"/>
+              <w:jc w:val="center"/>
+            </w:pPr>
+            <w:r>
+              <w:rPr>
+                <w:rFonts w:ascii="Calibri" w:cs="Calibri" w:eastAsia="Calibri" w:hAnsi="Calibri"/>
+                <w:i/>
+                <w:iCs/>
+                <w:color w:val="D8F0E2"/>
+                <w:sz w:val="16"/>
+                <w:szCs w:val="16"/>
+              </w:rPr>
+              <w:t xml:space="preserve">Postgres · Auth · Realtime · Storage</w:t>
+            </w:r>
+          </w:p>
+        </w:tc>
+        <w:tc>
+          <w:tcPr>
+            <w:tcW w:type="dxa" w:w="3125"/>
+            <w:tcBorders>
+              <w:top w:val="single" w:color="FFFFFF" w:sz="4"/>
+              <w:left w:val="single" w:color="FFFFFF" w:sz="4"/>
+              <w:bottom w:val="single" w:color="FFFFFF" w:sz="4"/>
+              <w:right w:val="single" w:color="FFFFFF" w:sz="4"/>
+            </w:tcBorders>
+            <w:tcMar>
+              <w:top w:type="dxa" w:w="0"/>
+              <w:left w:type="dxa" w:w="0"/>
+              <w:bottom w:type="dxa" w:w="0"/>
+              <w:right w:type="dxa" w:w="0"/>
+            </w:tcMar>
+          </w:tcPr>
+          <w:p>
+            <w:r>
+              <w:t xml:space="preserve"/>
+            </w:r>
+          </w:p>
+        </w:tc>
+      </w:tr>
+      <w:tr>
+        <w:tc>
+          <w:tcPr>
+            <w:tcW w:type="dxa" w:w="9300"/>
+            <w:tcBorders>
+              <w:top w:val="single" w:color="FFFFFF" w:sz="4"/>
+              <w:left w:val="single" w:color="FFFFFF" w:sz="4"/>
+              <w:bottom w:val="single" w:color="FFFFFF" w:sz="4"/>
+              <w:right w:val="single" w:color="FFFFFF" w:sz="4"/>
+            </w:tcBorders>
+            <w:tcMar>
+              <w:top w:type="dxa" w:w="60"/>
+              <w:left w:type="dxa" w:w="0"/>
+              <w:bottom w:type="dxa" w:w="60"/>
+              <w:right w:type="dxa" w:w="0"/>
+            </w:tcMar>
+          </w:tcPr>
+          <w:p>
+            <w:pPr>
+              <w:jc w:val="center"/>
+            </w:pPr>
+            <w:r>
+              <w:rPr>
+                <w:rFonts w:ascii="Calibri" w:cs="Calibri" w:eastAsia="Calibri" w:hAnsi="Calibri"/>
+                <w:i/>
+                <w:iCs/>
+                <w:color w:val="6B7C5C"/>
+                <w:sz w:val="16"/>
+                <w:szCs w:val="16"/>
+              </w:rPr>
+              <w:t xml:space="preserve">misma API REST y Realtime</w:t>
+            </w:r>
+          </w:p>
+        </w:tc>
+      </w:tr>
+    </w:tbl>
+    <w:tbl>
+      <w:tblPr>
+        <w:tblW w:type="dxa" w:w="9300"/>
+        <w:tblBorders>
+          <w:top w:val="single" w:color="auto" w:sz="4"/>
+          <w:left w:val="single" w:color="auto" w:sz="4"/>
+          <w:bottom w:val="single" w:color="auto" w:sz="4"/>
+          <w:right w:val="single" w:color="auto" w:sz="4"/>
+          <w:insideH w:val="single" w:color="auto" w:sz="4"/>
+          <w:insideV w:val="single" w:color="auto" w:sz="4"/>
+        </w:tblBorders>
+      </w:tblPr>
+      <w:tblGrid>
+        <w:gridCol w:w="3050"/>
+        <w:gridCol w:w="100"/>
+        <w:gridCol w:w="3000"/>
+        <w:gridCol w:w="100"/>
+        <w:gridCol w:w="3050"/>
+      </w:tblGrid>
+      <w:tr>
+        <w:tc>
+          <w:tcPr>
+            <w:tcW w:type="dxa" w:w="3050"/>
+            <w:tcBorders>
+              <w:top w:val="single" w:color="EAEFE6" w:sz="4"/>
+              <w:left w:val="single" w:color="EAEFE6" w:sz="4"/>
+              <w:bottom w:val="single" w:color="EAEFE6" w:sz="4"/>
+              <w:right w:val="single" w:color="EAEFE6" w:sz="4"/>
+            </w:tcBorders>
+            <w:shd w:fill="EAEFE6" w:val="clear"/>
+            <w:tcMar>
+              <w:top w:type="dxa" w:w="130"/>
+              <w:left w:type="dxa" w:w="130"/>
+              <w:bottom w:type="dxa" w:w="130"/>
+              <w:right w:type="dxa" w:w="130"/>
+            </w:tcMar>
+            <w:vAlign w:val="center"/>
+          </w:tcPr>
+          <w:p>
+            <w:pPr>
+              <w:spacing w:after="50" w:before="0"/>
+              <w:jc w:val="center"/>
+            </w:pPr>
+            <w:r>
+              <w:rPr>
+                <w:rFonts w:ascii="Calibri" w:cs="Calibri" w:eastAsia="Calibri" w:hAnsi="Calibri"/>
+                <w:b/>
+                <w:bCs/>
+                <w:color w:val="1A1F18"/>
+                <w:sz w:val="22"/>
+                <w:szCs w:val="22"/>
+              </w:rPr>
+              <w:t xml:space="preserve">WEB</w:t>
+            </w:r>
+          </w:p>
+          <w:p>
+            <w:pPr>
+              <w:spacing w:after="0" w:before="0"/>
+              <w:jc w:val="center"/>
+            </w:pPr>
+            <w:r>
+              <w:rPr>
+                <w:rFonts w:ascii="Calibri" w:cs="Calibri" w:eastAsia="Calibri" w:hAnsi="Calibri"/>
+                <w:i/>
+                <w:iCs/>
+                <w:color w:val="4A5446"/>
+                <w:sz w:val="16"/>
+                <w:szCs w:val="16"/>
+              </w:rPr>
+              <w:t xml:space="preserve">Vercel · Marketing + App</w:t>
+            </w:r>
+          </w:p>
+        </w:tc>
+        <w:tc>
+          <w:tcPr>
+            <w:tcW w:type="dxa" w:w="100"/>
+            <w:tcBorders>
+              <w:top w:val="single" w:color="FFFFFF" w:sz="4"/>
+              <w:left w:val="single" w:color="FFFFFF" w:sz="4"/>
+              <w:bottom w:val="single" w:color="FFFFFF" w:sz="4"/>
+              <w:right w:val="single" w:color="FFFFFF" w:sz="4"/>
+            </w:tcBorders>
+            <w:tcMar>
+              <w:top w:type="dxa" w:w="0"/>
+              <w:left w:type="dxa" w:w="0"/>
+              <w:bottom w:type="dxa" w:w="0"/>
+              <w:right w:type="dxa" w:w="0"/>
+            </w:tcMar>
+          </w:tcPr>
+          <w:p>
+            <w:r>
+              <w:t xml:space="preserve"/>
+            </w:r>
+          </w:p>
+        </w:tc>
+        <w:tc>
+          <w:tcPr>
+            <w:tcW w:type="dxa" w:w="3050"/>
+            <w:tcBorders>
+              <w:top w:val="single" w:color="EAEFE6" w:sz="4"/>
+              <w:left w:val="single" w:color="EAEFE6" w:sz="4"/>
+              <w:bottom w:val="single" w:color="EAEFE6" w:sz="4"/>
+              <w:right w:val="single" w:color="EAEFE6" w:sz="4"/>
+            </w:tcBorders>
+            <w:shd w:fill="EAEFE6" w:val="clear"/>
+            <w:tcMar>
+              <w:top w:type="dxa" w:w="130"/>
+              <w:left w:type="dxa" w:w="130"/>
+              <w:bottom w:type="dxa" w:w="130"/>
+              <w:right w:type="dxa" w:w="130"/>
+            </w:tcMar>
+            <w:vAlign w:val="center"/>
+          </w:tcPr>
+          <w:p>
+            <w:pPr>
+              <w:spacing w:after="50" w:before="0"/>
+              <w:jc w:val="center"/>
+            </w:pPr>
+            <w:r>
+              <w:rPr>
+                <w:rFonts w:ascii="Calibri" w:cs="Calibri" w:eastAsia="Calibri" w:hAnsi="Calibri"/>
+                <w:b/>
+                <w:bCs/>
+                <w:color w:val="1A1F18"/>
+                <w:sz w:val="22"/>
+                <w:szCs w:val="22"/>
+              </w:rPr>
+              <w:t xml:space="preserve">MÓVIL</w:t>
+            </w:r>
+          </w:p>
+          <w:p>
+            <w:pPr>
+              <w:spacing w:after="0" w:before="0"/>
+              <w:jc w:val="center"/>
+            </w:pPr>
+            <w:r>
+              <w:rPr>
+                <w:rFonts w:ascii="Calibri" w:cs="Calibri" w:eastAsia="Calibri" w:hAnsi="Calibri"/>
+                <w:i/>
+                <w:iCs/>
+                <w:color w:val="4A5446"/>
+                <w:sz w:val="16"/>
+                <w:szCs w:val="16"/>
+              </w:rPr>
+              <w:t xml:space="preserve">PWA / Capacitor / Expo</w:t>
+            </w:r>
+          </w:p>
+        </w:tc>
+        <w:tc>
+          <w:tcPr>
+            <w:tcW w:type="dxa" w:w="100"/>
+            <w:tcBorders>
+              <w:top w:val="single" w:color="FFFFFF" w:sz="4"/>
+              <w:left w:val="single" w:color="FFFFFF" w:sz="4"/>
+              <w:bottom w:val="single" w:color="FFFFFF" w:sz="4"/>
+              <w:right w:val="single" w:color="FFFFFF" w:sz="4"/>
+            </w:tcBorders>
+            <w:tcMar>
+              <w:top w:type="dxa" w:w="0"/>
+              <w:left w:type="dxa" w:w="0"/>
+              <w:bottom w:type="dxa" w:w="0"/>
+              <w:right w:type="dxa" w:w="0"/>
+            </w:tcMar>
+          </w:tcPr>
+          <w:p>
+            <w:r>
+              <w:t xml:space="preserve"/>
+            </w:r>
+          </w:p>
+        </w:tc>
+        <w:tc>
+          <w:tcPr>
+            <w:tcW w:type="dxa" w:w="3050"/>
+            <w:tcBorders>
+              <w:top w:val="single" w:color="EAEFE6" w:sz="4"/>
+              <w:left w:val="single" w:color="EAEFE6" w:sz="4"/>
+              <w:bottom w:val="single" w:color="EAEFE6" w:sz="4"/>
+              <w:right w:val="single" w:color="EAEFE6" w:sz="4"/>
+            </w:tcBorders>
+            <w:shd w:fill="EAEFE6" w:val="clear"/>
+            <w:tcMar>
+              <w:top w:type="dxa" w:w="130"/>
+              <w:left w:type="dxa" w:w="130"/>
+              <w:bottom w:type="dxa" w:w="130"/>
+              <w:right w:type="dxa" w:w="130"/>
+            </w:tcMar>
+            <w:vAlign w:val="center"/>
+          </w:tcPr>
+          <w:p>
+            <w:pPr>
+              <w:spacing w:after="50" w:before="0"/>
+              <w:jc w:val="center"/>
+            </w:pPr>
+            <w:r>
+              <w:rPr>
+                <w:rFonts w:ascii="Calibri" w:cs="Calibri" w:eastAsia="Calibri" w:hAnsi="Calibri"/>
+                <w:b/>
+                <w:bCs/>
+                <w:color w:val="1A1F18"/>
+                <w:sz w:val="22"/>
+                <w:szCs w:val="22"/>
+              </w:rPr>
+              <w:t xml:space="preserve">FUTURO</w:t>
+            </w:r>
+          </w:p>
+          <w:p>
+            <w:pPr>
+              <w:spacing w:after="0" w:before="0"/>
+              <w:jc w:val="center"/>
+            </w:pPr>
+            <w:r>
+              <w:rPr>
+                <w:rFonts w:ascii="Calibri" w:cs="Calibri" w:eastAsia="Calibri" w:hAnsi="Calibri"/>
+                <w:i/>
+                <w:iCs/>
+                <w:color w:val="4A5446"/>
+                <w:sz w:val="16"/>
+                <w:szCs w:val="16"/>
+              </w:rPr>
+              <w:t xml:space="preserve">CRM · Admin · API pública</w:t>
+            </w:r>
+          </w:p>
+        </w:tc>
+      </w:tr>
+    </w:tbl>
+    <w:p>
+      <w:pPr>
+        <w:spacing w:after="120" w:before="60"/>
+        <w:jc w:val="left"/>
+      </w:pPr>
+      <w:r>
+        <w:rPr>
+          <w:rFonts w:ascii="Calibri" w:cs="Calibri" w:eastAsia="Calibri" w:hAnsi="Calibri"/>
+          <w:color w:val="1A1F18"/>
+          <w:sz w:val="22"/>
+          <w:szCs w:val="22"/>
+        </w:rPr>
+        <w:t xml:space="preserve"/>
+      </w:r>
+    </w:p>
+    <w:p>
+      <w:pPr>
+        <w:spacing w:after="80" w:before="240"/>
+      </w:pPr>
+      <w:r>
+        <w:rPr>
+          <w:rFonts w:ascii="Calibri" w:cs="Calibri" w:eastAsia="Calibri" w:hAnsi="Calibri"/>
+          <w:b/>
+          <w:bCs/>
+          <w:color w:val="1A1F18"/>
+          <w:sz w:val="20"/>
+          <w:szCs w:val="20"/>
+        </w:rPr>
+        <w:t xml:space="preserve">Hosting recomendado por componente</w:t>
+      </w:r>
+    </w:p>
+    <w:tbl>
+      <w:tblPr>
+        <w:tblW w:type="dxa" w:w="9360"/>
+        <w:tblBorders>
+          <w:top w:val="single" w:color="auto" w:sz="4"/>
+          <w:left w:val="single" w:color="auto" w:sz="4"/>
+          <w:bottom w:val="single" w:color="auto" w:sz="4"/>
+          <w:right w:val="single" w:color="auto" w:sz="4"/>
+          <w:insideH w:val="single" w:color="auto" w:sz="4"/>
+          <w:insideV w:val="single" w:color="auto" w:sz="4"/>
+        </w:tblBorders>
+      </w:tblPr>
+      <w:tblGrid>
+        <w:gridCol w:w="2700"/>
+        <w:gridCol w:w="2200"/>
+        <w:gridCol w:w="4460"/>
+      </w:tblGrid>
+      <w:tr>
+        <w:trPr>
+          <w:tblHeader/>
+        </w:trPr>
+        <w:tc>
+          <w:tcPr>
+            <w:tcW w:type="dxa" w:w="2700"/>
+            <w:tcBorders>
+              <w:top w:val="single" w:color="CCCCCC" w:sz="4"/>
+              <w:left w:val="single" w:color="CCCCCC" w:sz="4"/>
+              <w:bottom w:val="single" w:color="CCCCCC" w:sz="4"/>
+              <w:right w:val="single" w:color="CCCCCC" w:sz="4"/>
+            </w:tcBorders>
+            <w:shd w:fill="14994B" w:val="clear"/>
+            <w:tcMar>
+              <w:top w:type="dxa" w:w="90"/>
+              <w:left w:type="dxa" w:w="130"/>
+              <w:bottom w:type="dxa" w:w="90"/>
+              <w:right w:type="dxa" w:w="130"/>
+            </w:tcMar>
+            <w:vAlign w:val="center"/>
+          </w:tcPr>
+          <w:p>
+            <w:pPr>
+              <w:spacing w:after="30" w:before="30"/>
+              <w:jc w:val="left"/>
+            </w:pPr>
+            <w:r>
+              <w:rPr>
+                <w:rFonts w:ascii="Calibri" w:cs="Calibri" w:eastAsia="Calibri" w:hAnsi="Calibri"/>
+                <w:b/>
+                <w:bCs/>
+                <w:color w:val="FFFFFF"/>
+                <w:sz w:val="20"/>
+                <w:szCs w:val="20"/>
+              </w:rPr>
+              <w:t xml:space="preserve">Componente</w:t>
+            </w:r>
+          </w:p>
+        </w:tc>
+        <w:tc>
+          <w:tcPr>
+            <w:tcW w:type="dxa" w:w="2200"/>
+            <w:tcBorders>
+              <w:top w:val="single" w:color="CCCCCC" w:sz="4"/>
+              <w:left w:val="single" w:color="CCCCCC" w:sz="4"/>
+              <w:bottom w:val="single" w:color="CCCCCC" w:sz="4"/>
+              <w:right w:val="single" w:color="CCCCCC" w:sz="4"/>
+            </w:tcBorders>
+            <w:shd w:fill="14994B" w:val="clear"/>
+            <w:tcMar>
+              <w:top w:type="dxa" w:w="90"/>
+              <w:left w:type="dxa" w:w="130"/>
+              <w:bottom w:type="dxa" w:w="90"/>
+              <w:right w:type="dxa" w:w="130"/>
+            </w:tcMar>
+            <w:vAlign w:val="center"/>
+          </w:tcPr>
+          <w:p>
+            <w:pPr>
+              <w:spacing w:after="30" w:before="30"/>
+              <w:jc w:val="left"/>
+            </w:pPr>
+            <w:r>
+              <w:rPr>
+                <w:rFonts w:ascii="Calibri" w:cs="Calibri" w:eastAsia="Calibri" w:hAnsi="Calibri"/>
+                <w:b/>
+                <w:bCs/>
+                <w:color w:val="FFFFFF"/>
+                <w:sz w:val="20"/>
+                <w:szCs w:val="20"/>
+              </w:rPr>
+              <w:t xml:space="preserve">Hosting</w:t>
+            </w:r>
+          </w:p>
+        </w:tc>
+        <w:tc>
+          <w:tcPr>
+            <w:tcW w:type="dxa" w:w="4460"/>
+            <w:tcBorders>
+              <w:top w:val="single" w:color="CCCCCC" w:sz="4"/>
+              <w:left w:val="single" w:color="CCCCCC" w:sz="4"/>
+              <w:bottom w:val="single" w:color="CCCCCC" w:sz="4"/>
+              <w:right w:val="single" w:color="CCCCCC" w:sz="4"/>
+            </w:tcBorders>
+            <w:shd w:fill="14994B" w:val="clear"/>
+            <w:tcMar>
+              <w:top w:type="dxa" w:w="90"/>
+              <w:left w:type="dxa" w:w="130"/>
+              <w:bottom w:type="dxa" w:w="90"/>
+              <w:right w:type="dxa" w:w="130"/>
+            </w:tcMar>
+            <w:vAlign w:val="center"/>
+          </w:tcPr>
+          <w:p>
+            <w:pPr>
+              <w:spacing w:after="30" w:before="30"/>
+              <w:jc w:val="left"/>
+            </w:pPr>
+            <w:r>
+              <w:rPr>
+                <w:rFonts w:ascii="Calibri" w:cs="Calibri" w:eastAsia="Calibri" w:hAnsi="Calibri"/>
+                <w:b/>
+                <w:bCs/>
+                <w:color w:val="FFFFFF"/>
+                <w:sz w:val="20"/>
+                <w:szCs w:val="20"/>
+              </w:rPr>
+              <w:t xml:space="preserve">Por qué</w:t>
+            </w:r>
+          </w:p>
+        </w:tc>
+      </w:tr>
+      <w:tr>
+        <w:tc>
+          <w:tcPr>
+            <w:tcW w:type="dxa" w:w="2700"/>
+            <w:tcBorders>
+              <w:top w:val="single" w:color="CCCCCC" w:sz="4"/>
+              <w:left w:val="single" w:color="CCCCCC" w:sz="4"/>
+              <w:bottom w:val="single" w:color="CCCCCC" w:sz="4"/>
+              <w:right w:val="single" w:color="CCCCCC" w:sz="4"/>
+            </w:tcBorders>
+            <w:tcMar>
+              <w:top w:type="dxa" w:w="90"/>
+              <w:left w:type="dxa" w:w="130"/>
+              <w:bottom w:type="dxa" w:w="90"/>
+              <w:right w:type="dxa" w:w="130"/>
+            </w:tcMar>
+            <w:vAlign w:val="center"/>
+          </w:tcPr>
+          <w:p>
+            <w:pPr>
+              <w:spacing w:after="30" w:before="30"/>
+              <w:jc w:val="left"/>
+            </w:pPr>
+            <w:r>
+              <w:rPr>
+                <w:rFonts w:ascii="Calibri" w:cs="Calibri" w:eastAsia="Calibri" w:hAnsi="Calibri"/>
+                <w:b/>
+                <w:bCs/>
+                <w:color w:val="0E7A3B"/>
+                <w:sz w:val="20"/>
+                <w:szCs w:val="20"/>
+              </w:rPr>
+              <w:t xml:space="preserve">Sitio marketing actual</w:t>
+            </w:r>
+          </w:p>
+        </w:tc>
+        <w:tc>
+          <w:tcPr>
+            <w:tcW w:type="dxa" w:w="2200"/>
+            <w:tcBorders>
+              <w:top w:val="single" w:color="CCCCCC" w:sz="4"/>
+              <w:left w:val="single" w:color="CCCCCC" w:sz="4"/>
+              <w:bottom w:val="single" w:color="CCCCCC" w:sz="4"/>
+              <w:right w:val="single" w:color="CCCCCC" w:sz="4"/>
+            </w:tcBorders>
+            <w:tcMar>
+              <w:top w:type="dxa" w:w="90"/>
+              <w:left w:type="dxa" w:w="130"/>
+              <w:bottom w:type="dxa" w:w="90"/>
+              <w:right w:type="dxa" w:w="130"/>
+            </w:tcMar>
+            <w:vAlign w:val="center"/>
+          </w:tcPr>
+          <w:p>
+            <w:pPr>
+              <w:spacing w:after="30" w:before="30"/>
+              <w:jc w:val="left"/>
+            </w:pPr>
+            <w:r>
+              <w:rPr>
+                <w:rFonts w:ascii="Calibri" w:cs="Calibri" w:eastAsia="Calibri" w:hAnsi="Calibri"/>
+                <w:color w:val="4A5446"/>
+                <w:sz w:val="20"/>
+                <w:szCs w:val="20"/>
+              </w:rPr>
+              <w:t xml:space="preserve">GitHub Pages</w:t>
+            </w:r>
+          </w:p>
+        </w:tc>
+        <w:tc>
+          <w:tcPr>
+            <w:tcW w:type="dxa" w:w="4460"/>
+            <w:tcBorders>
+              <w:top w:val="single" w:color="CCCCCC" w:sz="4"/>
+              <w:left w:val="single" w:color="CCCCCC" w:sz="4"/>
+              <w:bottom w:val="single" w:color="CCCCCC" w:sz="4"/>
+              <w:right w:val="single" w:color="CCCCCC" w:sz="4"/>
+            </w:tcBorders>
+            <w:tcMar>
+              <w:top w:type="dxa" w:w="90"/>
+              <w:left w:type="dxa" w:w="130"/>
+              <w:bottom w:type="dxa" w:w="90"/>
+              <w:right w:type="dxa" w:w="130"/>
+            </w:tcMar>
+            <w:vAlign w:val="center"/>
+          </w:tcPr>
+          <w:p>
+            <w:pPr>
+              <w:spacing w:after="30" w:before="30"/>
+              <w:jc w:val="left"/>
+            </w:pPr>
+            <w:r>
+              <w:rPr>
+                <w:rFonts w:ascii="Calibri" w:cs="Calibri" w:eastAsia="Calibri" w:hAnsi="Calibri"/>
+                <w:i/>
+                <w:iCs/>
+                <w:color w:val="4A5446"/>
+                <w:sz w:val="20"/>
+                <w:szCs w:val="20"/>
+              </w:rPr>
+              <w:t xml:space="preserve">Estático, ya en producción. Sin necesidad de migrar.</w:t>
+            </w:r>
+          </w:p>
+        </w:tc>
+      </w:tr>
+      <w:tr>
+        <w:tc>
+          <w:tcPr>
+            <w:tcW w:type="dxa" w:w="2700"/>
+            <w:tcBorders>
+              <w:top w:val="single" w:color="CCCCCC" w:sz="4"/>
+              <w:left w:val="single" w:color="CCCCCC" w:sz="4"/>
+              <w:bottom w:val="single" w:color="CCCCCC" w:sz="4"/>
+              <w:right w:val="single" w:color="CCCCCC" w:sz="4"/>
+            </w:tcBorders>
+            <w:shd w:fill="EAEFE6" w:val="clear"/>
+            <w:tcMar>
+              <w:top w:type="dxa" w:w="90"/>
+              <w:left w:type="dxa" w:w="130"/>
+              <w:bottom w:type="dxa" w:w="90"/>
+              <w:right w:type="dxa" w:w="130"/>
+            </w:tcMar>
+            <w:vAlign w:val="center"/>
+          </w:tcPr>
+          <w:p>
+            <w:pPr>
+              <w:spacing w:after="30" w:before="30"/>
+              <w:jc w:val="left"/>
+            </w:pPr>
+            <w:r>
+              <w:rPr>
+                <w:rFonts w:ascii="Calibri" w:cs="Calibri" w:eastAsia="Calibri" w:hAnsi="Calibri"/>
+                <w:b/>
+                <w:bCs/>
+                <w:color w:val="0E7A3B"/>
+                <w:sz w:val="20"/>
+                <w:szCs w:val="20"/>
+              </w:rPr>
+              <w:t xml:space="preserve">Web App de reservas</w:t>
+            </w:r>
+          </w:p>
+        </w:tc>
+        <w:tc>
+          <w:tcPr>
+            <w:tcW w:type="dxa" w:w="2200"/>
+            <w:tcBorders>
+              <w:top w:val="single" w:color="CCCCCC" w:sz="4"/>
+              <w:left w:val="single" w:color="CCCCCC" w:sz="4"/>
+              <w:bottom w:val="single" w:color="CCCCCC" w:sz="4"/>
+              <w:right w:val="single" w:color="CCCCCC" w:sz="4"/>
+            </w:tcBorders>
+            <w:shd w:fill="EAEFE6" w:val="clear"/>
+            <w:tcMar>
+              <w:top w:type="dxa" w:w="90"/>
+              <w:left w:type="dxa" w:w="130"/>
+              <w:bottom w:type="dxa" w:w="90"/>
+              <w:right w:type="dxa" w:w="130"/>
+            </w:tcMar>
+            <w:vAlign w:val="center"/>
+          </w:tcPr>
+          <w:p>
+            <w:pPr>
+              <w:spacing w:after="30" w:before="30"/>
+              <w:jc w:val="left"/>
+            </w:pPr>
+            <w:r>
+              <w:rPr>
+                <w:rFonts w:ascii="Calibri" w:cs="Calibri" w:eastAsia="Calibri" w:hAnsi="Calibri"/>
+                <w:color w:val="4A5446"/>
+                <w:sz w:val="20"/>
+                <w:szCs w:val="20"/>
+              </w:rPr>
+              <w:t xml:space="preserve">Vercel</w:t>
+            </w:r>
+          </w:p>
+        </w:tc>
+        <w:tc>
+          <w:tcPr>
+            <w:tcW w:type="dxa" w:w="4460"/>
+            <w:tcBorders>
+              <w:top w:val="single" w:color="CCCCCC" w:sz="4"/>
+              <w:left w:val="single" w:color="CCCCCC" w:sz="4"/>
+              <w:bottom w:val="single" w:color="CCCCCC" w:sz="4"/>
+              <w:right w:val="single" w:color="CCCCCC" w:sz="4"/>
+            </w:tcBorders>
+            <w:shd w:fill="EAEFE6" w:val="clear"/>
+            <w:tcMar>
+              <w:top w:type="dxa" w:w="90"/>
+              <w:left w:type="dxa" w:w="130"/>
+              <w:bottom w:type="dxa" w:w="90"/>
+              <w:right w:type="dxa" w:w="130"/>
+            </w:tcMar>
+            <w:vAlign w:val="center"/>
+          </w:tcPr>
+          <w:p>
+            <w:pPr>
+              <w:spacing w:after="30" w:before="30"/>
+              <w:jc w:val="left"/>
+            </w:pPr>
+            <w:r>
+              <w:rPr>
+                <w:rFonts w:ascii="Calibri" w:cs="Calibri" w:eastAsia="Calibri" w:hAnsi="Calibri"/>
+                <w:i/>
+                <w:iCs/>
+                <w:color w:val="4A5446"/>
+                <w:sz w:val="20"/>
+                <w:szCs w:val="20"/>
+              </w:rPr>
+              <w:t xml:space="preserve">Preview por rama, CDN edge, funciones serverless, mejor DX.</w:t>
+            </w:r>
+          </w:p>
+        </w:tc>
+      </w:tr>
+      <w:tr>
+        <w:tc>
+          <w:tcPr>
+            <w:tcW w:type="dxa" w:w="2700"/>
+            <w:tcBorders>
+              <w:top w:val="single" w:color="CCCCCC" w:sz="4"/>
+              <w:left w:val="single" w:color="CCCCCC" w:sz="4"/>
+              <w:bottom w:val="single" w:color="CCCCCC" w:sz="4"/>
+              <w:right w:val="single" w:color="CCCCCC" w:sz="4"/>
+            </w:tcBorders>
+            <w:tcMar>
+              <w:top w:type="dxa" w:w="90"/>
+              <w:left w:type="dxa" w:w="130"/>
+              <w:bottom w:type="dxa" w:w="90"/>
+              <w:right w:type="dxa" w:w="130"/>
+            </w:tcMar>
+            <w:vAlign w:val="center"/>
+          </w:tcPr>
+          <w:p>
+            <w:pPr>
+              <w:spacing w:after="30" w:before="30"/>
+              <w:jc w:val="left"/>
+            </w:pPr>
+            <w:r>
+              <w:rPr>
+                <w:rFonts w:ascii="Calibri" w:cs="Calibri" w:eastAsia="Calibri" w:hAnsi="Calibri"/>
+                <w:b/>
+                <w:bCs/>
+                <w:color w:val="0E7A3B"/>
+                <w:sz w:val="20"/>
+                <w:szCs w:val="20"/>
+              </w:rPr>
+              <w:t xml:space="preserve">Backend / datos</w:t>
+            </w:r>
+          </w:p>
+        </w:tc>
+        <w:tc>
+          <w:tcPr>
+            <w:tcW w:type="dxa" w:w="2200"/>
+            <w:tcBorders>
+              <w:top w:val="single" w:color="CCCCCC" w:sz="4"/>
+              <w:left w:val="single" w:color="CCCCCC" w:sz="4"/>
+              <w:bottom w:val="single" w:color="CCCCCC" w:sz="4"/>
+              <w:right w:val="single" w:color="CCCCCC" w:sz="4"/>
+            </w:tcBorders>
+            <w:tcMar>
+              <w:top w:type="dxa" w:w="90"/>
+              <w:left w:type="dxa" w:w="130"/>
+              <w:bottom w:type="dxa" w:w="90"/>
+              <w:right w:type="dxa" w:w="130"/>
+            </w:tcMar>
+            <w:vAlign w:val="center"/>
+          </w:tcPr>
+          <w:p>
+            <w:pPr>
+              <w:spacing w:after="30" w:before="30"/>
+              <w:jc w:val="left"/>
+            </w:pPr>
+            <w:r>
+              <w:rPr>
+                <w:rFonts w:ascii="Calibri" w:cs="Calibri" w:eastAsia="Calibri" w:hAnsi="Calibri"/>
+                <w:color w:val="4A5446"/>
+                <w:sz w:val="20"/>
+                <w:szCs w:val="20"/>
+              </w:rPr>
+              <w:t xml:space="preserve">Supabase</w:t>
+            </w:r>
+          </w:p>
+        </w:tc>
+        <w:tc>
+          <w:tcPr>
+            <w:tcW w:type="dxa" w:w="4460"/>
+            <w:tcBorders>
+              <w:top w:val="single" w:color="CCCCCC" w:sz="4"/>
+              <w:left w:val="single" w:color="CCCCCC" w:sz="4"/>
+              <w:bottom w:val="single" w:color="CCCCCC" w:sz="4"/>
+              <w:right w:val="single" w:color="CCCCCC" w:sz="4"/>
+            </w:tcBorders>
+            <w:tcMar>
+              <w:top w:type="dxa" w:w="90"/>
+              <w:left w:type="dxa" w:w="130"/>
+              <w:bottom w:type="dxa" w:w="90"/>
+              <w:right w:type="dxa" w:w="130"/>
+            </w:tcMar>
+            <w:vAlign w:val="center"/>
+          </w:tcPr>
+          <w:p>
+            <w:pPr>
+              <w:spacing w:after="30" w:before="30"/>
+              <w:jc w:val="left"/>
+            </w:pPr>
+            <w:r>
+              <w:rPr>
+                <w:rFonts w:ascii="Calibri" w:cs="Calibri" w:eastAsia="Calibri" w:hAnsi="Calibri"/>
+                <w:i/>
+                <w:iCs/>
+                <w:color w:val="4A5446"/>
+                <w:sz w:val="20"/>
+                <w:szCs w:val="20"/>
+              </w:rPr>
+              <w:t xml:space="preserve">Auth + DB + Realtime en un solo servicio. Plan gratuito generoso.</w:t>
+            </w:r>
+          </w:p>
+        </w:tc>
+      </w:tr>
+    </w:tbl>
+    <w:p>
+      <w:pPr>
+        <w:pStyle w:val="Heading2"/>
+        <w:spacing w:after="100" w:before="320"/>
+      </w:pPr>
+      <w:r>
+        <w:rPr>
+          <w:rFonts w:ascii="Calibri" w:cs="Calibri" w:eastAsia="Calibri" w:hAnsi="Calibri"/>
+          <w:b/>
+          <w:bCs/>
+          <w:color w:val="1A1F18"/>
+          <w:sz w:val="24"/>
+          <w:szCs w:val="24"/>
+        </w:rPr>
+        <w:t xml:space="preserve">07 · Roadmap móvil (3 etapas)</w:t>
+      </w:r>
+    </w:p>
+    <w:p>
+      <w:pPr>
+        <w:spacing w:after="160" w:before="60"/>
+        <w:jc w:val="left"/>
+      </w:pPr>
+      <w:r>
+        <w:rPr>
+          <w:rFonts w:ascii="Calibri" w:cs="Calibri" w:eastAsia="Calibri" w:hAnsi="Calibri"/>
+          <w:i/>
+          <w:iCs/>
+          <w:color w:val="4A5446"/>
+          <w:sz w:val="22"/>
+          <w:szCs w:val="22"/>
+        </w:rPr>
+        <w:t xml:space="preserve">Empezamos por PWA (cero costo) y solo escalamos a app nativa si la tracción lo justifica. Sin tomar decisiones prematuras.</w:t>
+      </w:r>
+    </w:p>
+    <w:tbl>
+      <w:tblPr>
+        <w:tblW w:type="dxa" w:w="9360"/>
+        <w:tblBorders>
+          <w:top w:val="single" w:color="auto" w:sz="4"/>
+          <w:left w:val="single" w:color="auto" w:sz="4"/>
+          <w:bottom w:val="single" w:color="auto" w:sz="4"/>
+          <w:right w:val="single" w:color="auto" w:sz="4"/>
+          <w:insideH w:val="single" w:color="auto" w:sz="4"/>
+          <w:insideV w:val="single" w:color="auto" w:sz="4"/>
+        </w:tblBorders>
+      </w:tblPr>
+      <w:tblGrid>
+        <w:gridCol w:w="1800"/>
+        <w:gridCol w:w="1900"/>
+        <w:gridCol w:w="1500"/>
+        <w:gridCol w:w="4160"/>
+      </w:tblGrid>
+      <w:tr>
+        <w:trPr>
+          <w:tblHeader/>
+        </w:trPr>
+        <w:tc>
+          <w:tcPr>
+            <w:tcW w:type="dxa" w:w="1800"/>
+            <w:tcBorders>
+              <w:top w:val="single" w:color="CCCCCC" w:sz="4"/>
+              <w:left w:val="single" w:color="CCCCCC" w:sz="4"/>
+              <w:bottom w:val="single" w:color="CCCCCC" w:sz="4"/>
+              <w:right w:val="single" w:color="CCCCCC" w:sz="4"/>
+            </w:tcBorders>
+            <w:shd w:fill="14994B" w:val="clear"/>
+            <w:tcMar>
+              <w:top w:type="dxa" w:w="90"/>
+              <w:left w:type="dxa" w:w="130"/>
+              <w:bottom w:type="dxa" w:w="90"/>
+              <w:right w:type="dxa" w:w="130"/>
+            </w:tcMar>
+            <w:vAlign w:val="center"/>
+          </w:tcPr>
+          <w:p>
+            <w:pPr>
+              <w:spacing w:after="30" w:before="30"/>
+              <w:jc w:val="left"/>
+            </w:pPr>
+            <w:r>
+              <w:rPr>
+                <w:rFonts w:ascii="Calibri" w:cs="Calibri" w:eastAsia="Calibri" w:hAnsi="Calibri"/>
+                <w:b/>
+                <w:bCs/>
+                <w:color w:val="FFFFFF"/>
+                <w:sz w:val="20"/>
+                <w:szCs w:val="20"/>
+              </w:rPr>
+              <w:t xml:space="preserve">Etapa</w:t>
+            </w:r>
+          </w:p>
+        </w:tc>
+        <w:tc>
+          <w:tcPr>
+            <w:tcW w:type="dxa" w:w="1900"/>
+            <w:tcBorders>
+              <w:top w:val="single" w:color="CCCCCC" w:sz="4"/>
+              <w:left w:val="single" w:color="CCCCCC" w:sz="4"/>
+              <w:bottom w:val="single" w:color="CCCCCC" w:sz="4"/>
+              <w:right w:val="single" w:color="CCCCCC" w:sz="4"/>
+            </w:tcBorders>
+            <w:shd w:fill="14994B" w:val="clear"/>
+            <w:tcMar>
+              <w:top w:type="dxa" w:w="90"/>
+              <w:left w:type="dxa" w:w="130"/>
+              <w:bottom w:type="dxa" w:w="90"/>
+              <w:right w:type="dxa" w:w="130"/>
+            </w:tcMar>
+            <w:vAlign w:val="center"/>
+          </w:tcPr>
+          <w:p>
+            <w:pPr>
+              <w:spacing w:after="30" w:before="30"/>
+              <w:jc w:val="left"/>
+            </w:pPr>
+            <w:r>
+              <w:rPr>
+                <w:rFonts w:ascii="Calibri" w:cs="Calibri" w:eastAsia="Calibri" w:hAnsi="Calibri"/>
+                <w:b/>
+                <w:bCs/>
+                <w:color w:val="FFFFFF"/>
+                <w:sz w:val="20"/>
+                <w:szCs w:val="20"/>
+              </w:rPr>
+              <w:t xml:space="preserve">Tecnología</w:t>
+            </w:r>
+          </w:p>
+        </w:tc>
+        <w:tc>
+          <w:tcPr>
+            <w:tcW w:type="dxa" w:w="1500"/>
+            <w:tcBorders>
+              <w:top w:val="single" w:color="CCCCCC" w:sz="4"/>
+              <w:left w:val="single" w:color="CCCCCC" w:sz="4"/>
+              <w:bottom w:val="single" w:color="CCCCCC" w:sz="4"/>
+              <w:right w:val="single" w:color="CCCCCC" w:sz="4"/>
+            </w:tcBorders>
+            <w:shd w:fill="14994B" w:val="clear"/>
+            <w:tcMar>
+              <w:top w:type="dxa" w:w="90"/>
+              <w:left w:type="dxa" w:w="130"/>
+              <w:bottom w:type="dxa" w:w="90"/>
+              <w:right w:type="dxa" w:w="130"/>
+            </w:tcMar>
+            <w:vAlign w:val="center"/>
+          </w:tcPr>
+          <w:p>
+            <w:pPr>
+              <w:spacing w:after="30" w:before="30"/>
+              <w:jc w:val="left"/>
+            </w:pPr>
+            <w:r>
+              <w:rPr>
+                <w:rFonts w:ascii="Calibri" w:cs="Calibri" w:eastAsia="Calibri" w:hAnsi="Calibri"/>
+                <w:b/>
+                <w:bCs/>
+                <w:color w:val="FFFFFF"/>
+                <w:sz w:val="20"/>
+                <w:szCs w:val="20"/>
+              </w:rPr>
+              <w:t xml:space="preserve">Tiempo</w:t>
+            </w:r>
+          </w:p>
+        </w:tc>
+        <w:tc>
+          <w:tcPr>
+            <w:tcW w:type="dxa" w:w="4160"/>
+            <w:tcBorders>
+              <w:top w:val="single" w:color="CCCCCC" w:sz="4"/>
+              <w:left w:val="single" w:color="CCCCCC" w:sz="4"/>
+              <w:bottom w:val="single" w:color="CCCCCC" w:sz="4"/>
+              <w:right w:val="single" w:color="CCCCCC" w:sz="4"/>
+            </w:tcBorders>
+            <w:shd w:fill="14994B" w:val="clear"/>
+            <w:tcMar>
+              <w:top w:type="dxa" w:w="90"/>
+              <w:left w:type="dxa" w:w="130"/>
+              <w:bottom w:type="dxa" w:w="90"/>
+              <w:right w:type="dxa" w:w="130"/>
+            </w:tcMar>
+            <w:vAlign w:val="center"/>
+          </w:tcPr>
+          <w:p>
+            <w:pPr>
+              <w:spacing w:after="30" w:before="30"/>
+              <w:jc w:val="left"/>
+            </w:pPr>
+            <w:r>
+              <w:rPr>
+                <w:rFonts w:ascii="Calibri" w:cs="Calibri" w:eastAsia="Calibri" w:hAnsi="Calibri"/>
+                <w:b/>
+                <w:bCs/>
+                <w:color w:val="FFFFFF"/>
+                <w:sz w:val="20"/>
+                <w:szCs w:val="20"/>
+              </w:rPr>
+              <w:t xml:space="preserve">Qué obtienes</w:t>
+            </w:r>
+          </w:p>
+        </w:tc>
+      </w:tr>
+      <w:tr>
+        <w:tc>
+          <w:tcPr>
+            <w:tcW w:type="dxa" w:w="1800"/>
+            <w:tcBorders>
+              <w:top w:val="single" w:color="CCCCCC" w:sz="4"/>
+              <w:left w:val="single" w:color="CCCCCC" w:sz="4"/>
+              <w:bottom w:val="single" w:color="CCCCCC" w:sz="4"/>
+              <w:right w:val="single" w:color="CCCCCC" w:sz="4"/>
+            </w:tcBorders>
+            <w:tcMar>
+              <w:top w:type="dxa" w:w="90"/>
+              <w:left w:type="dxa" w:w="130"/>
+              <w:bottom w:type="dxa" w:w="90"/>
+              <w:right w:type="dxa" w:w="130"/>
+            </w:tcMar>
+            <w:vAlign w:val="center"/>
+          </w:tcPr>
+          <w:p>
+            <w:pPr>
+              <w:spacing w:after="30" w:before="30"/>
+              <w:jc w:val="left"/>
+            </w:pPr>
+            <w:r>
+              <w:rPr>
+                <w:rFonts w:ascii="Calibri" w:cs="Calibri" w:eastAsia="Calibri" w:hAnsi="Calibri"/>
+                <w:b/>
+                <w:bCs/>
+                <w:color w:val="0E7A3B"/>
+                <w:sz w:val="20"/>
+                <w:szCs w:val="20"/>
+              </w:rPr>
+              <w:t xml:space="preserve">1. PWA</w:t>
+            </w:r>
+          </w:p>
+        </w:tc>
+        <w:tc>
+          <w:tcPr>
+            <w:tcW w:type="dxa" w:w="1900"/>
+            <w:tcBorders>
+              <w:top w:val="single" w:color="CCCCCC" w:sz="4"/>
+              <w:left w:val="single" w:color="CCCCCC" w:sz="4"/>
+              <w:bottom w:val="single" w:color="CCCCCC" w:sz="4"/>
+              <w:right w:val="single" w:color="CCCCCC" w:sz="4"/>
+            </w:tcBorders>
+            <w:tcMar>
+              <w:top w:type="dxa" w:w="90"/>
+              <w:left w:type="dxa" w:w="130"/>
+              <w:bottom w:type="dxa" w:w="90"/>
+              <w:right w:type="dxa" w:w="130"/>
+            </w:tcMar>
+            <w:vAlign w:val="center"/>
+          </w:tcPr>
+          <w:p>
+            <w:pPr>
+              <w:spacing w:after="30" w:before="30"/>
+              <w:jc w:val="left"/>
+            </w:pPr>
+            <w:r>
+              <w:rPr>
+                <w:rFonts w:ascii="Calibri" w:cs="Calibri" w:eastAsia="Calibri" w:hAnsi="Calibri"/>
+                <w:i/>
+                <w:iCs/>
+                <w:color w:val="4A5446"/>
+                <w:sz w:val="20"/>
+                <w:szCs w:val="20"/>
+              </w:rPr>
+              <w:t xml:space="preserve">Web App + manifest</w:t>
+            </w:r>
+          </w:p>
+        </w:tc>
+        <w:tc>
+          <w:tcPr>
+            <w:tcW w:type="dxa" w:w="1500"/>
+            <w:tcBorders>
+              <w:top w:val="single" w:color="CCCCCC" w:sz="4"/>
+              <w:left w:val="single" w:color="CCCCCC" w:sz="4"/>
+              <w:bottom w:val="single" w:color="CCCCCC" w:sz="4"/>
+              <w:right w:val="single" w:color="CCCCCC" w:sz="4"/>
+            </w:tcBorders>
+            <w:tcMar>
+              <w:top w:type="dxa" w:w="90"/>
+              <w:left w:type="dxa" w:w="130"/>
+              <w:bottom w:type="dxa" w:w="90"/>
+              <w:right w:type="dxa" w:w="130"/>
+            </w:tcMar>
+            <w:vAlign w:val="center"/>
+          </w:tcPr>
+          <w:p>
+            <w:pPr>
+              <w:spacing w:after="30" w:before="30"/>
+              <w:jc w:val="left"/>
+            </w:pPr>
+            <w:r>
+              <w:rPr>
+                <w:rFonts w:ascii="Calibri" w:cs="Calibri" w:eastAsia="Calibri" w:hAnsi="Calibri"/>
+                <w:color w:val="4A5446"/>
+                <w:sz w:val="20"/>
+                <w:szCs w:val="20"/>
+              </w:rPr>
+              <w:t xml:space="preserve">1-2 días</w:t>
+            </w:r>
+          </w:p>
+        </w:tc>
+        <w:tc>
+          <w:tcPr>
+            <w:tcW w:type="dxa" w:w="4160"/>
+            <w:tcBorders>
+              <w:top w:val="single" w:color="CCCCCC" w:sz="4"/>
+              <w:left w:val="single" w:color="CCCCCC" w:sz="4"/>
+              <w:bottom w:val="single" w:color="CCCCCC" w:sz="4"/>
+              <w:right w:val="single" w:color="CCCCCC" w:sz="4"/>
+            </w:tcBorders>
+            <w:tcMar>
+              <w:top w:type="dxa" w:w="90"/>
+              <w:left w:type="dxa" w:w="130"/>
+              <w:bottom w:type="dxa" w:w="90"/>
+              <w:right w:type="dxa" w:w="130"/>
+            </w:tcMar>
+            <w:vAlign w:val="center"/>
+          </w:tcPr>
+          <w:p>
+            <w:pPr>
+              <w:spacing w:after="30" w:before="30"/>
+              <w:jc w:val="left"/>
+            </w:pPr>
+            <w:r>
+              <w:rPr>
+                <w:rFonts w:ascii="Calibri" w:cs="Calibri" w:eastAsia="Calibri" w:hAnsi="Calibri"/>
+                <w:i/>
+                <w:iCs/>
+                <w:color w:val="4A5446"/>
+                <w:sz w:val="20"/>
+                <w:szCs w:val="20"/>
+              </w:rPr>
+              <w:t xml:space="preserve">Instalable desde Safari/Chrome. Sin tiendas. Sin costo extra.</w:t>
+            </w:r>
+          </w:p>
+        </w:tc>
+      </w:tr>
+      <w:tr>
+        <w:tc>
+          <w:tcPr>
+            <w:tcW w:type="dxa" w:w="1800"/>
+            <w:tcBorders>
+              <w:top w:val="single" w:color="CCCCCC" w:sz="4"/>
+              <w:left w:val="single" w:color="CCCCCC" w:sz="4"/>
+              <w:bottom w:val="single" w:color="CCCCCC" w:sz="4"/>
+              <w:right w:val="single" w:color="CCCCCC" w:sz="4"/>
+            </w:tcBorders>
+            <w:shd w:fill="EAEFE6" w:val="clear"/>
+            <w:tcMar>
+              <w:top w:type="dxa" w:w="90"/>
+              <w:left w:type="dxa" w:w="130"/>
+              <w:bottom w:type="dxa" w:w="90"/>
+              <w:right w:type="dxa" w:w="130"/>
+            </w:tcMar>
+            <w:vAlign w:val="center"/>
+          </w:tcPr>
+          <w:p>
+            <w:pPr>
+              <w:spacing w:after="30" w:before="30"/>
+              <w:jc w:val="left"/>
+            </w:pPr>
+            <w:r>
+              <w:rPr>
+                <w:rFonts w:ascii="Calibri" w:cs="Calibri" w:eastAsia="Calibri" w:hAnsi="Calibri"/>
+                <w:b/>
+                <w:bCs/>
+                <w:color w:val="0E7A3B"/>
+                <w:sz w:val="20"/>
+                <w:szCs w:val="20"/>
+              </w:rPr>
+              <w:t xml:space="preserve">2. Capacitor</w:t>
+            </w:r>
+          </w:p>
+        </w:tc>
+        <w:tc>
+          <w:tcPr>
+            <w:tcW w:type="dxa" w:w="1900"/>
+            <w:tcBorders>
+              <w:top w:val="single" w:color="CCCCCC" w:sz="4"/>
+              <w:left w:val="single" w:color="CCCCCC" w:sz="4"/>
+              <w:bottom w:val="single" w:color="CCCCCC" w:sz="4"/>
+              <w:right w:val="single" w:color="CCCCCC" w:sz="4"/>
+            </w:tcBorders>
+            <w:shd w:fill="EAEFE6" w:val="clear"/>
+            <w:tcMar>
+              <w:top w:type="dxa" w:w="90"/>
+              <w:left w:type="dxa" w:w="130"/>
+              <w:bottom w:type="dxa" w:w="90"/>
+              <w:right w:type="dxa" w:w="130"/>
+            </w:tcMar>
+            <w:vAlign w:val="center"/>
+          </w:tcPr>
+          <w:p>
+            <w:pPr>
+              <w:spacing w:after="30" w:before="30"/>
+              <w:jc w:val="left"/>
+            </w:pPr>
+            <w:r>
+              <w:rPr>
+                <w:rFonts w:ascii="Calibri" w:cs="Calibri" w:eastAsia="Calibri" w:hAnsi="Calibri"/>
+                <w:i/>
+                <w:iCs/>
+                <w:color w:val="4A5446"/>
+                <w:sz w:val="20"/>
+                <w:szCs w:val="20"/>
+              </w:rPr>
+              <w:t xml:space="preserve">Web → App nativa</w:t>
+            </w:r>
+          </w:p>
+        </w:tc>
+        <w:tc>
+          <w:tcPr>
+            <w:tcW w:type="dxa" w:w="1500"/>
+            <w:tcBorders>
+              <w:top w:val="single" w:color="CCCCCC" w:sz="4"/>
+              <w:left w:val="single" w:color="CCCCCC" w:sz="4"/>
+              <w:bottom w:val="single" w:color="CCCCCC" w:sz="4"/>
+              <w:right w:val="single" w:color="CCCCCC" w:sz="4"/>
+            </w:tcBorders>
+            <w:shd w:fill="EAEFE6" w:val="clear"/>
+            <w:tcMar>
+              <w:top w:type="dxa" w:w="90"/>
+              <w:left w:type="dxa" w:w="130"/>
+              <w:bottom w:type="dxa" w:w="90"/>
+              <w:right w:type="dxa" w:w="130"/>
+            </w:tcMar>
+            <w:vAlign w:val="center"/>
+          </w:tcPr>
+          <w:p>
+            <w:pPr>
+              <w:spacing w:after="30" w:before="30"/>
+              <w:jc w:val="left"/>
+            </w:pPr>
+            <w:r>
+              <w:rPr>
+                <w:rFonts w:ascii="Calibri" w:cs="Calibri" w:eastAsia="Calibri" w:hAnsi="Calibri"/>
+                <w:color w:val="4A5446"/>
+                <w:sz w:val="20"/>
+                <w:szCs w:val="20"/>
+              </w:rPr>
+              <w:t xml:space="preserve">1-2 semanas</w:t>
+            </w:r>
+          </w:p>
+        </w:tc>
+        <w:tc>
+          <w:tcPr>
+            <w:tcW w:type="dxa" w:w="4160"/>
+            <w:tcBorders>
+              <w:top w:val="single" w:color="CCCCCC" w:sz="4"/>
+              <w:left w:val="single" w:color="CCCCCC" w:sz="4"/>
+              <w:bottom w:val="single" w:color="CCCCCC" w:sz="4"/>
+              <w:right w:val="single" w:color="CCCCCC" w:sz="4"/>
+            </w:tcBorders>
+            <w:shd w:fill="EAEFE6" w:val="clear"/>
+            <w:tcMar>
+              <w:top w:type="dxa" w:w="90"/>
+              <w:left w:type="dxa" w:w="130"/>
+              <w:bottom w:type="dxa" w:w="90"/>
+              <w:right w:type="dxa" w:w="130"/>
+            </w:tcMar>
+            <w:vAlign w:val="center"/>
+          </w:tcPr>
+          <w:p>
+            <w:pPr>
+              <w:spacing w:after="30" w:before="30"/>
+              <w:jc w:val="left"/>
+            </w:pPr>
+            <w:r>
+              <w:rPr>
+                <w:rFonts w:ascii="Calibri" w:cs="Calibri" w:eastAsia="Calibri" w:hAnsi="Calibri"/>
+                <w:i/>
+                <w:iCs/>
+                <w:color w:val="4A5446"/>
+                <w:sz w:val="20"/>
+                <w:szCs w:val="20"/>
+              </w:rPr>
+              <w:t xml:space="preserve">App en App Store y Play Store. Reutiliza 95% del código web.</w:t>
+            </w:r>
+          </w:p>
+        </w:tc>
+      </w:tr>
+      <w:tr>
+        <w:tc>
+          <w:tcPr>
+            <w:tcW w:type="dxa" w:w="1800"/>
+            <w:tcBorders>
+              <w:top w:val="single" w:color="CCCCCC" w:sz="4"/>
+              <w:left w:val="single" w:color="CCCCCC" w:sz="4"/>
+              <w:bottom w:val="single" w:color="CCCCCC" w:sz="4"/>
+              <w:right w:val="single" w:color="CCCCCC" w:sz="4"/>
+            </w:tcBorders>
+            <w:tcMar>
+              <w:top w:type="dxa" w:w="90"/>
+              <w:left w:type="dxa" w:w="130"/>
+              <w:bottom w:type="dxa" w:w="90"/>
+              <w:right w:type="dxa" w:w="130"/>
+            </w:tcMar>
+            <w:vAlign w:val="center"/>
+          </w:tcPr>
+          <w:p>
+            <w:pPr>
+              <w:spacing w:after="30" w:before="30"/>
+              <w:jc w:val="left"/>
+            </w:pPr>
+            <w:r>
+              <w:rPr>
+                <w:rFonts w:ascii="Calibri" w:cs="Calibri" w:eastAsia="Calibri" w:hAnsi="Calibri"/>
+                <w:b/>
+                <w:bCs/>
+                <w:color w:val="0E7A3B"/>
+                <w:sz w:val="20"/>
+                <w:szCs w:val="20"/>
+              </w:rPr>
+              <w:t xml:space="preserve">3. React Native</w:t>
+            </w:r>
+          </w:p>
+        </w:tc>
+        <w:tc>
+          <w:tcPr>
+            <w:tcW w:type="dxa" w:w="1900"/>
+            <w:tcBorders>
+              <w:top w:val="single" w:color="CCCCCC" w:sz="4"/>
+              <w:left w:val="single" w:color="CCCCCC" w:sz="4"/>
+              <w:bottom w:val="single" w:color="CCCCCC" w:sz="4"/>
+              <w:right w:val="single" w:color="CCCCCC" w:sz="4"/>
+            </w:tcBorders>
+            <w:tcMar>
+              <w:top w:type="dxa" w:w="90"/>
+              <w:left w:type="dxa" w:w="130"/>
+              <w:bottom w:type="dxa" w:w="90"/>
+              <w:right w:type="dxa" w:w="130"/>
+            </w:tcMar>
+            <w:vAlign w:val="center"/>
+          </w:tcPr>
+          <w:p>
+            <w:pPr>
+              <w:spacing w:after="30" w:before="30"/>
+              <w:jc w:val="left"/>
+            </w:pPr>
+            <w:r>
+              <w:rPr>
+                <w:rFonts w:ascii="Calibri" w:cs="Calibri" w:eastAsia="Calibri" w:hAnsi="Calibri"/>
+                <w:i/>
+                <w:iCs/>
+                <w:color w:val="4A5446"/>
+                <w:sz w:val="20"/>
+                <w:szCs w:val="20"/>
+              </w:rPr>
+              <w:t xml:space="preserve">App nativa real</w:t>
+            </w:r>
+          </w:p>
+        </w:tc>
+        <w:tc>
+          <w:tcPr>
+            <w:tcW w:type="dxa" w:w="1500"/>
+            <w:tcBorders>
+              <w:top w:val="single" w:color="CCCCCC" w:sz="4"/>
+              <w:left w:val="single" w:color="CCCCCC" w:sz="4"/>
+              <w:bottom w:val="single" w:color="CCCCCC" w:sz="4"/>
+              <w:right w:val="single" w:color="CCCCCC" w:sz="4"/>
+            </w:tcBorders>
+            <w:tcMar>
+              <w:top w:type="dxa" w:w="90"/>
+              <w:left w:type="dxa" w:w="130"/>
+              <w:bottom w:type="dxa" w:w="90"/>
+              <w:right w:type="dxa" w:w="130"/>
+            </w:tcMar>
+            <w:vAlign w:val="center"/>
+          </w:tcPr>
+          <w:p>
+            <w:pPr>
+              <w:spacing w:after="30" w:before="30"/>
+              <w:jc w:val="left"/>
+            </w:pPr>
+            <w:r>
+              <w:rPr>
+                <w:rFonts w:ascii="Calibri" w:cs="Calibri" w:eastAsia="Calibri" w:hAnsi="Calibri"/>
+                <w:color w:val="4A5446"/>
+                <w:sz w:val="20"/>
+                <w:szCs w:val="20"/>
+              </w:rPr>
+              <w:t xml:space="preserve">4-6 semanas</w:t>
+            </w:r>
+          </w:p>
+        </w:tc>
+        <w:tc>
+          <w:tcPr>
+            <w:tcW w:type="dxa" w:w="4160"/>
+            <w:tcBorders>
+              <w:top w:val="single" w:color="CCCCCC" w:sz="4"/>
+              <w:left w:val="single" w:color="CCCCCC" w:sz="4"/>
+              <w:bottom w:val="single" w:color="CCCCCC" w:sz="4"/>
+              <w:right w:val="single" w:color="CCCCCC" w:sz="4"/>
+            </w:tcBorders>
+            <w:tcMar>
+              <w:top w:type="dxa" w:w="90"/>
+              <w:left w:type="dxa" w:w="130"/>
+              <w:bottom w:type="dxa" w:w="90"/>
+              <w:right w:type="dxa" w:w="130"/>
+            </w:tcMar>
+            <w:vAlign w:val="center"/>
+          </w:tcPr>
+          <w:p>
+            <w:pPr>
+              <w:spacing w:after="30" w:before="30"/>
+              <w:jc w:val="left"/>
+            </w:pPr>
+            <w:r>
+              <w:rPr>
+                <w:rFonts w:ascii="Calibri" w:cs="Calibri" w:eastAsia="Calibri" w:hAnsi="Calibri"/>
+                <w:i/>
+                <w:iCs/>
+                <w:color w:val="4A5446"/>
+                <w:sz w:val="20"/>
+                <w:szCs w:val="20"/>
+              </w:rPr>
+              <w:t xml:space="preserve">UX premium nativa. Sólo si Capacitor no alcanza.</w:t>
+            </w:r>
+          </w:p>
+        </w:tc>
+      </w:tr>
+    </w:tbl>
+    <w:p>
+      <w:pPr>
+        <w:pStyle w:val="Heading2"/>
+        <w:spacing w:after="100" w:before="320"/>
       </w:pPr>
       <w:r>
         <w:rPr>
@@ -1718,7 +3235,22 @@
           <w:sz w:val="22"/>
           <w:szCs w:val="22"/>
         </w:rPr>
-        <w:t xml:space="preserve">· Construir el MVP en 4 a 6 semanas (frontend + paneles + lógica de reservas).</w:t>
+        <w:t xml:space="preserve">· Construir el MVP web en 4 a 6 semanas (Vercel + Supabase, PWA-ready).</w:t>
+      </w:r>
+    </w:p>
+    <w:p>
+      <w:pPr>
+        <w:spacing w:after="30" w:before="60"/>
+        <w:jc w:val="left"/>
+      </w:pPr>
+      <w:r>
+        <w:rPr>
+          <w:rFonts w:ascii="Calibri" w:cs="Calibri" w:eastAsia="Calibri" w:hAnsi="Calibri"/>
+          <w:color w:val="1A1F18"/>
+          <w:sz w:val="22"/>
+          <w:szCs w:val="22"/>
+        </w:rPr>
+        <w:t xml:space="preserve">· Evaluar Capacitor para tienda de apps después de los primeros 3 meses.</w:t>
       </w:r>
     </w:p>
     <w:sectPr>

</xml_diff>